<commit_message>
Updated documents in support of Policy Assistant Production Validation Steps
</commit_message>
<xml_diff>
--- a/implementation/detailed-implementation-instructions/Policy_Assistant_Production_Validation_Steps.docx
+++ b/implementation/detailed-implementation-instructions/Policy_Assistant_Production_Validation_Steps.docx
@@ -46,9 +46,9 @@
       </w:r>
       <w:r>
         <w:rPr>
-          <w:color w:val="7030A0"/>
-        </w:rPr>
-        <w:t>IN PROCESS</w:t>
+          <w:color w:val="00B050"/>
+        </w:rPr>
+        <w:t>COMPLETE</w:t>
       </w:r>
     </w:p>
     <w:p>
@@ -80,17 +80,8 @@
           <w:b/>
           <w:bCs/>
         </w:rPr>
-        <w:t>named .</w:t>
-      </w:r>
-      <w:proofErr w:type="spellStart"/>
-      <w:r>
-        <w:rPr>
-          <w:b/>
-          <w:bCs/>
-        </w:rPr>
-        <w:t>env.production</w:t>
-      </w:r>
-      <w:proofErr w:type="spellEnd"/>
+        <w:t>named .env.production</w:t>
+      </w:r>
       <w:r>
         <w:t xml:space="preserve"> in the </w:t>
       </w:r>
@@ -208,26 +199,79 @@
         <w:pStyle w:val="Heading1"/>
       </w:pPr>
       <w:r>
-        <w:t>2. Confirm the production build uses .</w:t>
-      </w:r>
-      <w:proofErr w:type="spellStart"/>
-      <w:r>
-        <w:t>env.production</w:t>
-      </w:r>
-      <w:proofErr w:type="spellEnd"/>
-      <w:r>
-        <w:t xml:space="preserve"> – </w:t>
-      </w:r>
-      <w:r>
-        <w:rPr>
-          <w:color w:val="EE0000"/>
-        </w:rPr>
-        <w:t>NOT STARTED</w:t>
+        <w:t>2. Confirm the production build uses .env.production</w:t>
+      </w:r>
+      <w:r>
+        <w:t xml:space="preserve"> </w:t>
+      </w:r>
+      <w:r>
+        <w:t xml:space="preserve">– </w:t>
+      </w:r>
+      <w:r>
+        <w:rPr>
+          <w:color w:val="00B050"/>
+        </w:rPr>
+        <w:t>COMPLETE</w:t>
       </w:r>
     </w:p>
     <w:p>
       <w:r>
-        <w:t>Stop the Vite development server, remove the old build output, and create a fresh production build.</w:t>
+        <w:rPr>
+          <w:u w:val="thick"/>
+        </w:rPr>
+        <w:t>Stop</w:t>
+      </w:r>
+      <w:r>
+        <w:t xml:space="preserve"> the </w:t>
+      </w:r>
+      <w:r>
+        <w:rPr>
+          <w:b/>
+          <w:bCs/>
+        </w:rPr>
+        <w:t>Vite development server</w:t>
+      </w:r>
+      <w:r>
+        <w:t xml:space="preserve">, </w:t>
+      </w:r>
+      <w:r>
+        <w:rPr>
+          <w:u w:val="thick"/>
+        </w:rPr>
+        <w:t>remove</w:t>
+      </w:r>
+      <w:r>
+        <w:t xml:space="preserve"> the </w:t>
+      </w:r>
+      <w:r>
+        <w:rPr>
+          <w:b/>
+          <w:bCs/>
+        </w:rPr>
+        <w:t>old build output</w:t>
+      </w:r>
+      <w:r>
+        <w:t xml:space="preserve">, and </w:t>
+      </w:r>
+      <w:r>
+        <w:rPr>
+          <w:b/>
+          <w:bCs/>
+        </w:rPr>
+        <w:t xml:space="preserve">create </w:t>
+      </w:r>
+      <w:r>
+        <w:t>a</w:t>
+      </w:r>
+      <w:r>
+        <w:rPr>
+          <w:b/>
+          <w:bCs/>
+        </w:rPr>
+        <w:t xml:space="preserve"> fresh production build</w:t>
+      </w:r>
+      <w:r>
+        <w:t>.</w:t>
       </w:r>
     </w:p>
     <w:p>
@@ -268,14 +312,50 @@
       </w:r>
       <w:r>
         <w:rPr>
-          <w:color w:val="EE0000"/>
-        </w:rPr>
-        <w:t>NOT STARTED</w:t>
+          <w:color w:val="00B050"/>
+        </w:rPr>
+        <w:t>COMPLETE</w:t>
       </w:r>
     </w:p>
     <w:p>
       <w:r>
-        <w:t>Search the generated JavaScript files for the Function App hostname and required delegated scope.</w:t>
+        <w:rPr>
+          <w:u w:val="thick"/>
+        </w:rPr>
+        <w:t>Search</w:t>
+      </w:r>
+      <w:r>
+        <w:t xml:space="preserve"> the </w:t>
+      </w:r>
+      <w:r>
+        <w:rPr>
+          <w:b/>
+          <w:bCs/>
+        </w:rPr>
+        <w:t>generated JavaScript files</w:t>
+      </w:r>
+      <w:r>
+        <w:t xml:space="preserve"> for the </w:t>
+      </w:r>
+      <w:r>
+        <w:rPr>
+          <w:b/>
+          <w:bCs/>
+        </w:rPr>
+        <w:t>Function App hostname</w:t>
+      </w:r>
+      <w:r>
+        <w:t xml:space="preserve"> and </w:t>
+      </w:r>
+      <w:r>
+        <w:rPr>
+          <w:b/>
+          <w:bCs/>
+        </w:rPr>
+        <w:t>required delegated scope</w:t>
+      </w:r>
+      <w:r>
+        <w:t>.</w:t>
       </w:r>
     </w:p>
     <w:p>
@@ -315,7 +395,81 @@
     </w:p>
     <w:p>
       <w:r>
-        <w:t>Expected result: the first two searches return matches. The obsolete test_policy_assistant scope should not appear as active configuration.</w:t>
+        <w:rPr>
+          <w:u w:val="thick"/>
+        </w:rPr>
+        <w:t>Expected result</w:t>
+      </w:r>
+      <w:r>
+        <w:t xml:space="preserve">: the </w:t>
+      </w:r>
+      <w:r>
+        <w:rPr>
+          <w:b/>
+          <w:bCs/>
+        </w:rPr>
+        <w:t>first two searches</w:t>
+      </w:r>
+      <w:r>
+        <w:t xml:space="preserve"> return </w:t>
+      </w:r>
+      <w:r>
+        <w:rPr>
+          <w:b/>
+          <w:bCs/>
+        </w:rPr>
+        <w:t>matches</w:t>
+      </w:r>
+      <w:r>
+        <w:t xml:space="preserve">. The </w:t>
+      </w:r>
+      <w:r>
+        <w:rPr>
+          <w:b/>
+          <w:bCs/>
+        </w:rPr>
+        <w:t>obsolete test_policy_assistant scope</w:t>
+      </w:r>
+      <w:r>
+        <w:t xml:space="preserve"> </w:t>
+      </w:r>
+      <w:r>
+        <w:rPr>
+          <w:u w:val="thick"/>
+        </w:rPr>
+        <w:t>should not</w:t>
+      </w:r>
+      <w:r>
+        <w:t xml:space="preserve"> </w:t>
+      </w:r>
+      <w:r>
+        <w:rPr>
+          <w:b/>
+          <w:bCs/>
+        </w:rPr>
+        <w:t>appear</w:t>
+      </w:r>
+      <w:r>
+        <w:t xml:space="preserve"> </w:t>
+      </w:r>
+      <w:r>
+        <w:rPr>
+          <w:u w:val="thick"/>
+        </w:rPr>
+        <w:t>as</w:t>
+      </w:r>
+      <w:r>
+        <w:t xml:space="preserve"> </w:t>
+      </w:r>
+      <w:r>
+        <w:rPr>
+          <w:b/>
+          <w:bCs/>
+        </w:rPr>
+        <w:t>active configuration</w:t>
+      </w:r>
+      <w:r>
+        <w:t>.</w:t>
       </w:r>
     </w:p>
     <w:p>
@@ -327,21 +481,137 @@
         <w:t>4. Verify the client derives the conversation APIs correctly</w:t>
       </w:r>
       <w:r>
-        <w:t xml:space="preserve"> </w:t>
-      </w:r>
-      <w:r>
-        <w:t xml:space="preserve">– </w:t>
-      </w:r>
-      <w:r>
-        <w:rPr>
-          <w:color w:val="EE0000"/>
-        </w:rPr>
-        <w:t>NOT STARTED</w:t>
+        <w:t xml:space="preserve"> – </w:t>
+      </w:r>
+      <w:r>
+        <w:rPr>
+          <w:color w:val="00B050"/>
+        </w:rPr>
+        <w:t>COMPLETE</w:t>
       </w:r>
     </w:p>
     <w:p>
       <w:r>
-        <w:t>The React client should keep the full /api/policy-chat URL in VITE_POLICY_API_URL and derive the conversation endpoint by replacing /policy-chat with /conversations. You do not need separate environment variables for these endpoints.</w:t>
+        <w:t xml:space="preserve">The </w:t>
+      </w:r>
+      <w:r>
+        <w:rPr>
+          <w:b/>
+          <w:bCs/>
+        </w:rPr>
+        <w:t>React client</w:t>
+      </w:r>
+      <w:r>
+        <w:t xml:space="preserve"> should </w:t>
+      </w:r>
+      <w:r>
+        <w:rPr>
+          <w:u w:val="thick"/>
+        </w:rPr>
+        <w:t>keep</w:t>
+      </w:r>
+      <w:r>
+        <w:t xml:space="preserve"> the </w:t>
+      </w:r>
+      <w:r>
+        <w:rPr>
+          <w:b/>
+          <w:bCs/>
+        </w:rPr>
+        <w:t>full /api/policy-chat URL</w:t>
+      </w:r>
+      <w:r>
+        <w:t xml:space="preserve"> in </w:t>
+      </w:r>
+      <w:r>
+        <w:rPr>
+          <w:b/>
+          <w:bCs/>
+        </w:rPr>
+        <w:t>VITE_POLICY_API_URL</w:t>
+      </w:r>
+      <w:r>
+        <w:t xml:space="preserve"> </w:t>
+      </w:r>
+      <w:r>
+        <w:rPr>
+          <w:u w:val="thick"/>
+        </w:rPr>
+        <w:t>and derive</w:t>
+      </w:r>
+      <w:r>
+        <w:t xml:space="preserve"> the </w:t>
+      </w:r>
+      <w:r>
+        <w:rPr>
+          <w:b/>
+          <w:bCs/>
+        </w:rPr>
+        <w:t>conversation endpoint</w:t>
+      </w:r>
+      <w:r>
+        <w:t xml:space="preserve"> by </w:t>
+      </w:r>
+      <w:r>
+        <w:rPr>
+          <w:b/>
+          <w:bCs/>
+        </w:rPr>
+        <w:t xml:space="preserve">replacing /policy-chat </w:t>
+      </w:r>
+      <w:r>
+        <w:rPr>
+          <w:u w:val="thick"/>
+        </w:rPr>
+        <w:t>with</w:t>
+      </w:r>
+      <w:r>
+        <w:rPr>
+          <w:b/>
+          <w:bCs/>
+        </w:rPr>
+        <w:t xml:space="preserve"> /conversations</w:t>
+      </w:r>
+      <w:r>
+        <w:t xml:space="preserve">. </w:t>
+      </w:r>
+      <w:r>
+        <w:rPr>
+          <w:u w:val="thick"/>
+        </w:rPr>
+        <w:t>You do not need separate</w:t>
+      </w:r>
+      <w:r>
+        <w:t xml:space="preserve"> </w:t>
+      </w:r>
+      <w:r>
+        <w:rPr>
+          <w:b/>
+          <w:bCs/>
+        </w:rPr>
+        <w:t>environment variables</w:t>
+      </w:r>
+      <w:r>
+        <w:t xml:space="preserve"> </w:t>
+      </w:r>
+      <w:r>
+        <w:rPr>
+          <w:u w:val="thick"/>
+        </w:rPr>
+        <w:t>for</w:t>
+      </w:r>
+      <w:r>
+        <w:t xml:space="preserve"> </w:t>
+      </w:r>
+      <w:r>
+        <w:rPr>
+          <w:b/>
+          <w:bCs/>
+        </w:rPr>
+        <w:t>these endpoints</w:t>
+      </w:r>
+      <w:r>
+        <w:t>.</w:t>
       </w:r>
     </w:p>
     <w:p>
@@ -369,21 +639,93 @@
         <w:t>5. Deploy the React production build</w:t>
       </w:r>
       <w:r>
-        <w:t xml:space="preserve"> </w:t>
-      </w:r>
-      <w:r>
-        <w:t xml:space="preserve">– </w:t>
-      </w:r>
-      <w:r>
-        <w:rPr>
-          <w:color w:val="EE0000"/>
-        </w:rPr>
-        <w:t>NOT STARTED</w:t>
+        <w:t xml:space="preserve"> – </w:t>
+      </w:r>
+      <w:r>
+        <w:rPr>
+          <w:color w:val="00B050"/>
+        </w:rPr>
+        <w:t>COMPLETE</w:t>
       </w:r>
     </w:p>
     <w:p>
       <w:r>
-        <w:t>Deploy the contents of the dist folder to the production React hosting service. Record the final HTTPS site URL.</w:t>
+        <w:rPr>
+          <w:u w:val="thick"/>
+        </w:rPr>
+        <w:t>Deploy</w:t>
+      </w:r>
+      <w:r>
+        <w:t xml:space="preserve"> the </w:t>
+      </w:r>
+      <w:r>
+        <w:rPr>
+          <w:b/>
+          <w:bCs/>
+        </w:rPr>
+        <w:t>contents</w:t>
+      </w:r>
+      <w:r>
+        <w:t xml:space="preserve"> of the </w:t>
+      </w:r>
+      <w:r>
+        <w:rPr>
+          <w:b/>
+          <w:bCs/>
+        </w:rPr>
+        <w:t>dist folder</w:t>
+      </w:r>
+      <w:r>
+        <w:t xml:space="preserve"> </w:t>
+      </w:r>
+      <w:r>
+        <w:rPr>
+          <w:u w:val="thick"/>
+        </w:rPr>
+        <w:t>to</w:t>
+      </w:r>
+      <w:r>
+        <w:t xml:space="preserve"> the </w:t>
+      </w:r>
+      <w:r>
+        <w:rPr>
+          <w:b/>
+          <w:bCs/>
+        </w:rPr>
+        <w:t>production React hosting service</w:t>
+      </w:r>
+      <w:r>
+        <w:t xml:space="preserve">. </w:t>
+      </w:r>
+      <w:r>
+        <w:rPr>
+          <w:b/>
+          <w:bCs/>
+        </w:rPr>
+        <w:t>Record</w:t>
+      </w:r>
+      <w:r>
+        <w:t xml:space="preserve"> the </w:t>
+      </w:r>
+      <w:r>
+        <w:rPr>
+          <w:b/>
+          <w:bCs/>
+        </w:rPr>
+        <w:t>final HTTPS site</w:t>
+      </w:r>
+      <w:r>
+        <w:t xml:space="preserve"> </w:t>
+      </w:r>
+      <w:r>
+        <w:rPr>
+          <w:b/>
+          <w:bCs/>
+        </w:rPr>
+        <w:t>URL</w:t>
+      </w:r>
+      <w:r>
+        <w:t>.</w:t>
       </w:r>
     </w:p>
     <w:p>
@@ -392,7 +734,15 @@
         <w:keepLines/>
       </w:pPr>
       <w:r>
-        <w:t>Example:</w:t>
+        <w:rPr>
+          <w:b/>
+          <w:bCs/>
+          <w:color w:val="C00000"/>
+        </w:rPr>
+        <w:t>Example</w:t>
+      </w:r>
+      <w:r>
+        <w:t>:</w:t>
       </w:r>
       <w:r>
         <w:br/>
@@ -402,7 +752,18 @@
         <w:br/>
       </w:r>
       <w:r>
+        <w:rPr>
+          <w:b/>
+          <w:bCs/>
+        </w:rPr>
         <w:br/>
+      </w:r>
+      <w:r>
+        <w:rPr>
+          <w:b/>
+          <w:bCs/>
+          <w:color w:val="C00000"/>
+        </w:rPr>
         <w:t>or</w:t>
       </w:r>
       <w:r>
@@ -418,21 +779,79 @@
         <w:t>6. Record the exact production origin</w:t>
       </w:r>
       <w:r>
-        <w:t xml:space="preserve"> </w:t>
-      </w:r>
-      <w:r>
-        <w:t xml:space="preserve">– </w:t>
-      </w:r>
-      <w:r>
-        <w:rPr>
-          <w:color w:val="EE0000"/>
-        </w:rPr>
-        <w:t>NOT STARTED</w:t>
+        <w:t xml:space="preserve"> – </w:t>
+      </w:r>
+      <w:r>
+        <w:rPr>
+          <w:color w:val="00B050"/>
+        </w:rPr>
+        <w:t>COMPLETE</w:t>
       </w:r>
     </w:p>
     <w:p>
       <w:r>
-        <w:t>Use only the scheme and hostname for CORS. Do not include a path such as /, /index.html, /chat, or /api.</w:t>
+        <w:rPr>
+          <w:u w:val="thick"/>
+        </w:rPr>
+        <w:t>Use only</w:t>
+      </w:r>
+      <w:r>
+        <w:t xml:space="preserve"> the </w:t>
+      </w:r>
+      <w:r>
+        <w:rPr>
+          <w:b/>
+          <w:bCs/>
+        </w:rPr>
+        <w:t>scheme</w:t>
+      </w:r>
+      <w:r>
+        <w:t xml:space="preserve"> and </w:t>
+      </w:r>
+      <w:r>
+        <w:rPr>
+          <w:b/>
+          <w:bCs/>
+        </w:rPr>
+        <w:t>hostname</w:t>
+      </w:r>
+      <w:r>
+        <w:t xml:space="preserve"> for </w:t>
+      </w:r>
+      <w:r>
+        <w:rPr>
+          <w:b/>
+          <w:bCs/>
+        </w:rPr>
+        <w:t>CORS</w:t>
+      </w:r>
+      <w:r>
+        <w:t xml:space="preserve">. </w:t>
+      </w:r>
+      <w:r>
+        <w:rPr>
+          <w:u w:val="thick"/>
+        </w:rPr>
+        <w:t>Do not include</w:t>
+      </w:r>
+      <w:r>
+        <w:t xml:space="preserve"> a </w:t>
+      </w:r>
+      <w:r>
+        <w:rPr>
+          <w:b/>
+          <w:bCs/>
+        </w:rPr>
+        <w:t xml:space="preserve">path </w:t>
+      </w:r>
+      <w:r>
+        <w:rPr>
+          <w:u w:val="thick"/>
+        </w:rPr>
+        <w:t>such as</w:t>
+      </w:r>
+      <w:r>
+        <w:t xml:space="preserve"> /, /index.html, /chat, or /api.</w:t>
       </w:r>
     </w:p>
     <w:p>
@@ -452,21 +871,133 @@
         <w:t>7. Add the production React origin to Function App CORS</w:t>
       </w:r>
       <w:r>
-        <w:t xml:space="preserve"> </w:t>
-      </w:r>
-      <w:r>
-        <w:t xml:space="preserve">– </w:t>
-      </w:r>
-      <w:r>
-        <w:rPr>
-          <w:color w:val="EE0000"/>
-        </w:rPr>
-        <w:t>NOT STARTED</w:t>
+        <w:t xml:space="preserve"> – </w:t>
+      </w:r>
+      <w:r>
+        <w:rPr>
+          <w:color w:val="00B050"/>
+        </w:rPr>
+        <w:t>COMPLETE</w:t>
       </w:r>
     </w:p>
     <w:p>
       <w:r>
-        <w:t>In Azure Portal, open the orchestration Function App and go to API &gt; CORS. Add the deployed React origin. Keep the localhost origin only if local development is still needed.</w:t>
+        <w:t xml:space="preserve">In </w:t>
+      </w:r>
+      <w:r>
+        <w:rPr>
+          <w:b/>
+          <w:bCs/>
+        </w:rPr>
+        <w:t>Azure Portal</w:t>
+      </w:r>
+      <w:r>
+        <w:t xml:space="preserve">, </w:t>
+      </w:r>
+      <w:r>
+        <w:rPr>
+          <w:u w:val="thick"/>
+        </w:rPr>
+        <w:t>open</w:t>
+      </w:r>
+      <w:r>
+        <w:t xml:space="preserve"> the </w:t>
+      </w:r>
+      <w:r>
+        <w:rPr>
+          <w:b/>
+          <w:bCs/>
+        </w:rPr>
+        <w:t>orchestration Function App</w:t>
+      </w:r>
+      <w:r>
+        <w:t xml:space="preserve"> and </w:t>
+      </w:r>
+      <w:r>
+        <w:rPr>
+          <w:u w:val="thick"/>
+        </w:rPr>
+        <w:t>go to</w:t>
+      </w:r>
+      <w:r>
+        <w:t xml:space="preserve"> </w:t>
+      </w:r>
+      <w:r>
+        <w:rPr>
+          <w:b/>
+          <w:bCs/>
+        </w:rPr>
+        <w:t>API &gt; CORS</w:t>
+      </w:r>
+      <w:r>
+        <w:t xml:space="preserve">. </w:t>
+      </w:r>
+      <w:r>
+        <w:rPr>
+          <w:u w:val="thick"/>
+        </w:rPr>
+        <w:t>Add</w:t>
+      </w:r>
+      <w:r>
+        <w:t xml:space="preserve"> the </w:t>
+      </w:r>
+      <w:r>
+        <w:rPr>
+          <w:b/>
+          <w:bCs/>
+        </w:rPr>
+        <w:t>deployed React origin</w:t>
+      </w:r>
+      <w:r>
+        <w:t xml:space="preserve">. </w:t>
+      </w:r>
+      <w:r>
+        <w:rPr>
+          <w:u w:val="thick"/>
+        </w:rPr>
+        <w:t>Keep</w:t>
+      </w:r>
+      <w:r>
+        <w:t xml:space="preserve"> the </w:t>
+      </w:r>
+      <w:r>
+        <w:rPr>
+          <w:b/>
+          <w:bCs/>
+        </w:rPr>
+        <w:t>localhost origin</w:t>
+      </w:r>
+      <w:r>
+        <w:t xml:space="preserve"> </w:t>
+      </w:r>
+      <w:r>
+        <w:rPr>
+          <w:u w:val="thick"/>
+        </w:rPr>
+        <w:t>only</w:t>
+      </w:r>
+      <w:r>
+        <w:t xml:space="preserve"> if </w:t>
+      </w:r>
+      <w:r>
+        <w:rPr>
+          <w:b/>
+          <w:bCs/>
+        </w:rPr>
+        <w:t>local development</w:t>
+      </w:r>
+      <w:r>
+        <w:t xml:space="preserve"> is </w:t>
+      </w:r>
+      <w:r>
+        <w:rPr>
+          <w:b/>
+          <w:bCs/>
+        </w:rPr>
+        <w:t>still needed</w:t>
+      </w:r>
+      <w:r>
+        <w:t>.</w:t>
       </w:r>
     </w:p>
     <w:p>
@@ -484,7 +1015,32 @@
     </w:p>
     <w:p>
       <w:r>
-        <w:t>Do not use a wildcard path such as https://your-policy-assistant.azurestaticapps.net/*.</w:t>
+        <w:rPr>
+          <w:u w:val="thick"/>
+        </w:rPr>
+        <w:t>Do not use</w:t>
+      </w:r>
+      <w:r>
+        <w:t xml:space="preserve"> a </w:t>
+      </w:r>
+      <w:r>
+        <w:rPr>
+          <w:b/>
+          <w:bCs/>
+        </w:rPr>
+        <w:t>wildcard path</w:t>
+      </w:r>
+      <w:r>
+        <w:t xml:space="preserve"> </w:t>
+      </w:r>
+      <w:r>
+        <w:rPr>
+          <w:u w:val="thick"/>
+        </w:rPr>
+        <w:t>such as</w:t>
+      </w:r>
+      <w:r>
+        <w:t xml:space="preserve"> https://your-policy-assistant.azurestaticapps.net/*.</w:t>
       </w:r>
     </w:p>
     <w:p>
@@ -495,21 +1051,114 @@
         <w:t>8. Avoid wildcard CORS in production</w:t>
       </w:r>
       <w:r>
-        <w:t xml:space="preserve"> </w:t>
-      </w:r>
-      <w:r>
-        <w:t xml:space="preserve">– </w:t>
-      </w:r>
-      <w:r>
-        <w:rPr>
-          <w:color w:val="EE0000"/>
-        </w:rPr>
-        <w:t>NOT STARTED</w:t>
+        <w:t xml:space="preserve"> – </w:t>
+      </w:r>
+      <w:r>
+        <w:rPr>
+          <w:color w:val="00B050"/>
+        </w:rPr>
+        <w:t>COMPLETE</w:t>
       </w:r>
     </w:p>
     <w:p>
       <w:r>
-        <w:t>Use the specific production React origin rather than *. The API still validates Entra bearer tokens, but CORS should remain restricted to intended browser origins.</w:t>
+        <w:rPr>
+          <w:u w:val="thick"/>
+        </w:rPr>
+        <w:t>Use</w:t>
+      </w:r>
+      <w:r>
+        <w:t xml:space="preserve"> the specific </w:t>
+      </w:r>
+      <w:r>
+        <w:rPr>
+          <w:b/>
+          <w:bCs/>
+        </w:rPr>
+        <w:t>production React origin</w:t>
+      </w:r>
+      <w:r>
+        <w:t xml:space="preserve"> </w:t>
+      </w:r>
+      <w:r>
+        <w:rPr>
+          <w:u w:val="thick"/>
+        </w:rPr>
+        <w:t>rather than</w:t>
+      </w:r>
+      <w:r>
+        <w:t xml:space="preserve"> *. The </w:t>
+      </w:r>
+      <w:r>
+        <w:rPr>
+          <w:b/>
+          <w:bCs/>
+        </w:rPr>
+        <w:t xml:space="preserve">API </w:t>
+      </w:r>
+      <w:r>
+        <w:rPr>
+          <w:u w:val="thick"/>
+        </w:rPr>
+        <w:t>still</w:t>
+      </w:r>
+      <w:r>
+        <w:rPr>
+          <w:b/>
+          <w:bCs/>
+        </w:rPr>
+        <w:t xml:space="preserve"> validates Entra bearer tokens</w:t>
+      </w:r>
+      <w:r>
+        <w:t xml:space="preserve">, </w:t>
+      </w:r>
+      <w:r>
+        <w:rPr>
+          <w:u w:val="thick"/>
+        </w:rPr>
+        <w:t>but</w:t>
+      </w:r>
+      <w:r>
+        <w:t xml:space="preserve"> </w:t>
+      </w:r>
+      <w:r>
+        <w:rPr>
+          <w:b/>
+          <w:bCs/>
+        </w:rPr>
+        <w:t>CORS</w:t>
+      </w:r>
+      <w:r>
+        <w:t xml:space="preserve"> </w:t>
+      </w:r>
+      <w:r>
+        <w:rPr>
+          <w:u w:val="thick"/>
+        </w:rPr>
+        <w:t>should remain</w:t>
+      </w:r>
+      <w:r>
+        <w:t xml:space="preserve"> </w:t>
+      </w:r>
+      <w:r>
+        <w:rPr>
+          <w:b/>
+          <w:bCs/>
+        </w:rPr>
+        <w:t>restricted</w:t>
+      </w:r>
+      <w:r>
+        <w:t xml:space="preserve"> to </w:t>
+      </w:r>
+      <w:r>
+        <w:rPr>
+          <w:b/>
+          <w:bCs/>
+        </w:rPr>
+        <w:t>intended browser origins</w:t>
+      </w:r>
+      <w:r>
+        <w:t>.</w:t>
       </w:r>
     </w:p>
     <w:p>
@@ -520,21 +1169,92 @@
         <w:t>9. Add the production redirect URI to the React SPA App Registration</w:t>
       </w:r>
       <w:r>
-        <w:t xml:space="preserve"> </w:t>
-      </w:r>
-      <w:r>
-        <w:t xml:space="preserve">– </w:t>
-      </w:r>
-      <w:r>
-        <w:rPr>
-          <w:color w:val="EE0000"/>
-        </w:rPr>
-        <w:t>NOT STARTED</w:t>
+        <w:t xml:space="preserve"> – </w:t>
+      </w:r>
+      <w:r>
+        <w:rPr>
+          <w:color w:val="00B050"/>
+        </w:rPr>
+        <w:t>COMPLETE</w:t>
       </w:r>
     </w:p>
     <w:p>
       <w:r>
-        <w:t>In Microsoft Entra ID, open the React client App Registration with client ID 5bb05e71-63a7-47e9-838c-38f384c1474f. Under Authentication &gt; Single-page application, add the deployed production URL.</w:t>
+        <w:t xml:space="preserve">In </w:t>
+      </w:r>
+      <w:r>
+        <w:rPr>
+          <w:b/>
+          <w:bCs/>
+        </w:rPr>
+        <w:t>Microsoft Entra ID</w:t>
+      </w:r>
+      <w:r>
+        <w:t xml:space="preserve">, </w:t>
+      </w:r>
+      <w:r>
+        <w:rPr>
+          <w:u w:val="thick"/>
+        </w:rPr>
+        <w:t>open</w:t>
+      </w:r>
+      <w:r>
+        <w:t xml:space="preserve"> the </w:t>
+      </w:r>
+      <w:r>
+        <w:rPr>
+          <w:b/>
+          <w:bCs/>
+        </w:rPr>
+        <w:t>React client App Registration</w:t>
+      </w:r>
+      <w:r>
+        <w:t xml:space="preserve"> with </w:t>
+      </w:r>
+      <w:r>
+        <w:rPr>
+          <w:b/>
+          <w:bCs/>
+        </w:rPr>
+        <w:t>client ID</w:t>
+      </w:r>
+      <w:r>
+        <w:t xml:space="preserve"> 5bb05e71-63a7-47e9-838c-38f384c1474f. </w:t>
+      </w:r>
+      <w:r>
+        <w:rPr>
+          <w:u w:val="thick"/>
+        </w:rPr>
+        <w:t>Under</w:t>
+      </w:r>
+      <w:r>
+        <w:rPr>
+          <w:b/>
+          <w:bCs/>
+        </w:rPr>
+        <w:t xml:space="preserve"> Authentication &gt; Single-page application</w:t>
+      </w:r>
+      <w:r>
+        <w:t xml:space="preserve">, </w:t>
+      </w:r>
+      <w:r>
+        <w:rPr>
+          <w:u w:val="thick"/>
+        </w:rPr>
+        <w:t>add</w:t>
+      </w:r>
+      <w:r>
+        <w:t xml:space="preserve"> the </w:t>
+      </w:r>
+      <w:r>
+        <w:rPr>
+          <w:b/>
+          <w:bCs/>
+        </w:rPr>
+        <w:t>deployed production URL</w:t>
+      </w:r>
+      <w:r>
+        <w:t>.</w:t>
       </w:r>
     </w:p>
     <w:p>
@@ -548,7 +1268,42 @@
     </w:p>
     <w:p>
       <w:r>
-        <w:t>Keep http://localhost:5173 if local development sign-in should continue to work.</w:t>
+        <w:rPr>
+          <w:u w:val="thick"/>
+        </w:rPr>
+        <w:t>Keep</w:t>
+      </w:r>
+      <w:r>
+        <w:t xml:space="preserve"> http://localhost:5173 if </w:t>
+      </w:r>
+      <w:r>
+        <w:rPr>
+          <w:b/>
+          <w:bCs/>
+        </w:rPr>
+        <w:t>local development sign-in</w:t>
+      </w:r>
+      <w:r>
+        <w:t xml:space="preserve"> should </w:t>
+      </w:r>
+      <w:r>
+        <w:rPr>
+          <w:u w:val="thick"/>
+        </w:rPr>
+        <w:t>continue</w:t>
+      </w:r>
+      <w:r>
+        <w:t xml:space="preserve"> to </w:t>
+      </w:r>
+      <w:r>
+        <w:rPr>
+          <w:b/>
+          <w:bCs/>
+        </w:rPr>
+        <w:t>work</w:t>
+      </w:r>
+      <w:r>
+        <w:t>.</w:t>
       </w:r>
     </w:p>
     <w:p>
@@ -560,21 +1315,110 @@
         <w:t>10. Confirm the React App Registration has the delegated API permission</w:t>
       </w:r>
       <w:r>
-        <w:t xml:space="preserve"> </w:t>
-      </w:r>
-      <w:r>
-        <w:t xml:space="preserve">– </w:t>
-      </w:r>
-      <w:r>
-        <w:rPr>
-          <w:color w:val="EE0000"/>
-        </w:rPr>
-        <w:t>NOT STARTED</w:t>
+        <w:t xml:space="preserve"> – </w:t>
+      </w:r>
+      <w:r>
+        <w:rPr>
+          <w:color w:val="00B050"/>
+        </w:rPr>
+        <w:t>COMPLETE</w:t>
       </w:r>
     </w:p>
     <w:p>
       <w:r>
-        <w:t>Under API permissions, confirm the React client has delegated permission to the Policy Assistant Orchestrator API scope access_policy_assistant.</w:t>
+        <w:rPr>
+          <w:u w:val="thick"/>
+        </w:rPr>
+        <w:t>Under</w:t>
+      </w:r>
+      <w:r>
+        <w:t xml:space="preserve"> </w:t>
+      </w:r>
+      <w:r>
+        <w:rPr>
+          <w:b/>
+          <w:bCs/>
+        </w:rPr>
+        <w:t>API permissions</w:t>
+      </w:r>
+      <w:r>
+        <w:t xml:space="preserve">, </w:t>
+      </w:r>
+      <w:r>
+        <w:rPr>
+          <w:u w:val="thick"/>
+        </w:rPr>
+        <w:t>confirm</w:t>
+      </w:r>
+      <w:r>
+        <w:t xml:space="preserve"> the </w:t>
+      </w:r>
+      <w:r>
+        <w:rPr>
+          <w:b/>
+          <w:bCs/>
+        </w:rPr>
+        <w:t>React client</w:t>
+      </w:r>
+      <w:r>
+        <w:t xml:space="preserve"> </w:t>
+      </w:r>
+      <w:r>
+        <w:rPr>
+          <w:u w:val="thick"/>
+        </w:rPr>
+        <w:t>has</w:t>
+      </w:r>
+      <w:r>
+        <w:t xml:space="preserve"> </w:t>
+      </w:r>
+      <w:r>
+        <w:rPr>
+          <w:b/>
+          <w:bCs/>
+        </w:rPr>
+        <w:t>delegated permission</w:t>
+      </w:r>
+      <w:r>
+        <w:t xml:space="preserve"> to the </w:t>
+      </w:r>
+      <w:r>
+        <w:rPr>
+          <w:b/>
+          <w:bCs/>
+        </w:rPr>
+        <w:t xml:space="preserve">Policy Assistant Orchestrator </w:t>
+      </w:r>
+      <w:r>
+        <w:rPr>
+          <w:b/>
+          <w:bCs/>
+        </w:rPr>
+        <w:t xml:space="preserve">- </w:t>
+      </w:r>
+      <w:r>
+        <w:rPr>
+          <w:b/>
+          <w:bCs/>
+        </w:rPr>
+        <w:t xml:space="preserve">API scope </w:t>
+      </w:r>
+      <w:r>
+        <w:rPr>
+          <w:b/>
+          <w:bCs/>
+        </w:rPr>
+        <w:t xml:space="preserve">- </w:t>
+      </w:r>
+      <w:r>
+        <w:rPr>
+          <w:b/>
+          <w:bCs/>
+        </w:rPr>
+        <w:t>access_policy_assistant</w:t>
+      </w:r>
+      <w:r>
+        <w:t>.</w:t>
       </w:r>
     </w:p>
     <w:p>
@@ -614,21 +1458,122 @@
         <w:t>11. Confirm the API App Registration still exposes the expected scope</w:t>
       </w:r>
       <w:r>
-        <w:t xml:space="preserve"> </w:t>
-      </w:r>
-      <w:r>
-        <w:t xml:space="preserve">– </w:t>
-      </w:r>
-      <w:r>
-        <w:rPr>
-          <w:color w:val="EE0000"/>
-        </w:rPr>
-        <w:t>NOT STARTED</w:t>
+        <w:t xml:space="preserve"> – </w:t>
+      </w:r>
+      <w:r>
+        <w:rPr>
+          <w:color w:val="00B050"/>
+        </w:rPr>
+        <w:t>COMPLETE</w:t>
       </w:r>
     </w:p>
     <w:p>
       <w:r>
-        <w:t>Open Policy Assistant Orchestrator API &gt; Expose an API and verify the Application ID URI and delegated scope remain enabled.</w:t>
+        <w:rPr>
+          <w:u w:val="thick"/>
+        </w:rPr>
+        <w:t>Open</w:t>
+      </w:r>
+      <w:r>
+        <w:rPr>
+          <w:b/>
+          <w:bCs/>
+        </w:rPr>
+        <w:t xml:space="preserve"> Policy Assistant Orchestrator API </w:t>
+      </w:r>
+      <w:r>
+        <w:t xml:space="preserve">&gt; </w:t>
+      </w:r>
+      <w:r>
+        <w:rPr>
+          <w:b/>
+          <w:bCs/>
+        </w:rPr>
+        <w:t>Expose</w:t>
+      </w:r>
+      <w:r>
+        <w:t xml:space="preserve"> </w:t>
+      </w:r>
+      <w:r>
+        <w:t>an</w:t>
+      </w:r>
+      <w:r>
+        <w:rPr>
+          <w:b/>
+          <w:bCs/>
+        </w:rPr>
+        <w:t xml:space="preserve"> API</w:t>
+      </w:r>
+      <w:r>
+        <w:t xml:space="preserve"> </w:t>
+      </w:r>
+      <w:r>
+        <w:rPr>
+          <w:u w:val="thick"/>
+        </w:rPr>
+        <w:t>and</w:t>
+      </w:r>
+      <w:r>
+        <w:t xml:space="preserve"> </w:t>
+      </w:r>
+      <w:r>
+        <w:rPr>
+          <w:b/>
+          <w:bCs/>
+        </w:rPr>
+        <w:t>verify</w:t>
+      </w:r>
+      <w:r>
+        <w:t xml:space="preserve"> the </w:t>
+      </w:r>
+      <w:r>
+        <w:rPr>
+          <w:b/>
+          <w:bCs/>
+        </w:rPr>
+        <w:t>Application ID URI</w:t>
+      </w:r>
+      <w:r>
+        <w:t xml:space="preserve"> and </w:t>
+      </w:r>
+      <w:r>
+        <w:rPr>
+          <w:b/>
+          <w:bCs/>
+        </w:rPr>
+        <w:t>delegated</w:t>
+      </w:r>
+      <w:r>
+        <w:t xml:space="preserve"> </w:t>
+      </w:r>
+      <w:r>
+        <w:rPr>
+          <w:b/>
+          <w:bCs/>
+        </w:rPr>
+        <w:t>scope</w:t>
+      </w:r>
+      <w:r>
+        <w:t xml:space="preserve"> </w:t>
+      </w:r>
+      <w:r>
+        <w:rPr>
+          <w:u w:val="thick"/>
+        </w:rPr>
+        <w:t>remain</w:t>
+      </w:r>
+      <w:r>
+        <w:t xml:space="preserve"> </w:t>
+      </w:r>
+      <w:r>
+        <w:rPr>
+          <w:b/>
+          <w:bCs/>
+        </w:rPr>
+        <w:t>enabled</w:t>
+      </w:r>
+      <w:r>
+        <w:t>.</w:t>
       </w:r>
     </w:p>
     <w:p>
@@ -674,37 +1619,102 @@
         <w:t>12. Open the deployed React application in a private browser window</w:t>
       </w:r>
       <w:r>
-        <w:t xml:space="preserve"> </w:t>
-      </w:r>
-      <w:r>
-        <w:t xml:space="preserve">– </w:t>
-      </w:r>
-      <w:r>
-        <w:rPr>
-          <w:color w:val="EE0000"/>
-        </w:rPr>
-        <w:t>NOT STARTED</w:t>
+        <w:t xml:space="preserve"> – </w:t>
+      </w:r>
+      <w:r>
+        <w:rPr>
+          <w:color w:val="00B050"/>
+        </w:rPr>
+        <w:t>COMPLETE</w:t>
       </w:r>
     </w:p>
     <w:p>
       <w:r>
-        <w:t xml:space="preserve">Using an incognito/private window helps avoid </w:t>
-      </w:r>
-      <w:proofErr w:type="gramStart"/>
-      <w:r>
-        <w:t>an existing</w:t>
-      </w:r>
-      <w:proofErr w:type="gramEnd"/>
+        <w:rPr>
+          <w:u w:val="thick"/>
+        </w:rPr>
+        <w:t>Using</w:t>
+      </w:r>
+      <w:r>
+        <w:t xml:space="preserve"> an </w:t>
+      </w:r>
+      <w:r>
+        <w:rPr>
+          <w:b/>
+          <w:bCs/>
+        </w:rPr>
+        <w:t>incognito/private window</w:t>
+      </w:r>
       <w:r>
         <w:t xml:space="preserve"> </w:t>
       </w:r>
-      <w:proofErr w:type="gramStart"/>
-      <w:r>
-        <w:t>localhost</w:t>
-      </w:r>
-      <w:proofErr w:type="gramEnd"/>
-      <w:r>
-        <w:t xml:space="preserve"> MSAL session masking a production configuration problem. Sign in through Microsoft Entra ID.</w:t>
+      <w:r>
+        <w:rPr>
+          <w:u w:val="thick"/>
+        </w:rPr>
+        <w:t>helps avoid</w:t>
+      </w:r>
+      <w:r>
+        <w:t xml:space="preserve"> an </w:t>
+      </w:r>
+      <w:r>
+        <w:rPr>
+          <w:b/>
+          <w:bCs/>
+        </w:rPr>
+        <w:t>existing localhost MSAL session masking</w:t>
+      </w:r>
+      <w:r>
+        <w:t xml:space="preserve"> a </w:t>
+      </w:r>
+      <w:r>
+        <w:rPr>
+          <w:b/>
+          <w:bCs/>
+        </w:rPr>
+        <w:t>production</w:t>
+      </w:r>
+      <w:r>
+        <w:t xml:space="preserve"> </w:t>
+      </w:r>
+      <w:r>
+        <w:rPr>
+          <w:b/>
+          <w:bCs/>
+        </w:rPr>
+        <w:t>configuration problem</w:t>
+      </w:r>
+      <w:r>
+        <w:t xml:space="preserve">. </w:t>
+      </w:r>
+      <w:r>
+        <w:rPr>
+          <w:b/>
+          <w:bCs/>
+        </w:rPr>
+        <w:t>Sign in</w:t>
+      </w:r>
+      <w:r>
+        <w:t xml:space="preserve"> </w:t>
+      </w:r>
+      <w:r>
+        <w:rPr>
+          <w:u w:val="thick"/>
+        </w:rPr>
+        <w:t>through</w:t>
+      </w:r>
+      <w:r>
+        <w:t xml:space="preserve"> </w:t>
+      </w:r>
+      <w:r>
+        <w:rPr>
+          <w:b/>
+          <w:bCs/>
+        </w:rPr>
+        <w:t>Microsoft Entra ID</w:t>
+      </w:r>
+      <w:r>
+        <w:t>.</w:t>
       </w:r>
     </w:p>
     <w:p>
@@ -715,21 +1725,102 @@
         <w:t>13. Check the browser console</w:t>
       </w:r>
       <w:r>
-        <w:t xml:space="preserve"> </w:t>
-      </w:r>
-      <w:r>
-        <w:t xml:space="preserve">– </w:t>
-      </w:r>
-      <w:r>
-        <w:rPr>
-          <w:color w:val="EE0000"/>
-        </w:rPr>
-        <w:t>NOT STARTED</w:t>
+        <w:t xml:space="preserve"> – </w:t>
+      </w:r>
+      <w:r>
+        <w:rPr>
+          <w:color w:val="00B050"/>
+        </w:rPr>
+        <w:t>COMPLETE</w:t>
       </w:r>
     </w:p>
     <w:p>
       <w:r>
-        <w:t>Open Chrome Developer Tools (F12) and review the Console. Confirm there are no JavaScript initialization, MSAL, or environment configuration errors.</w:t>
+        <w:rPr>
+          <w:u w:val="thick"/>
+        </w:rPr>
+        <w:t>Open</w:t>
+      </w:r>
+      <w:r>
+        <w:t xml:space="preserve"> </w:t>
+      </w:r>
+      <w:r>
+        <w:rPr>
+          <w:b/>
+          <w:bCs/>
+        </w:rPr>
+        <w:t>Chrome Developer Tools</w:t>
+      </w:r>
+      <w:r>
+        <w:t xml:space="preserve"> (F12) and </w:t>
+      </w:r>
+      <w:r>
+        <w:rPr>
+          <w:b/>
+          <w:bCs/>
+        </w:rPr>
+        <w:t>review</w:t>
+      </w:r>
+      <w:r>
+        <w:t xml:space="preserve"> the </w:t>
+      </w:r>
+      <w:r>
+        <w:rPr>
+          <w:b/>
+          <w:bCs/>
+        </w:rPr>
+        <w:t>Console</w:t>
+      </w:r>
+      <w:r>
+        <w:t xml:space="preserve">. </w:t>
+      </w:r>
+      <w:r>
+        <w:rPr>
+          <w:u w:val="thick"/>
+        </w:rPr>
+        <w:t>Confirm</w:t>
+      </w:r>
+      <w:r>
+        <w:t xml:space="preserve"> there </w:t>
+      </w:r>
+      <w:r>
+        <w:rPr>
+          <w:u w:val="thick"/>
+        </w:rPr>
+        <w:t>are no</w:t>
+      </w:r>
+      <w:r>
+        <w:t xml:space="preserve"> </w:t>
+      </w:r>
+      <w:r>
+        <w:rPr>
+          <w:b/>
+          <w:bCs/>
+        </w:rPr>
+        <w:t>JavaScript initialization</w:t>
+      </w:r>
+      <w:r>
+        <w:t xml:space="preserve">, </w:t>
+      </w:r>
+      <w:r>
+        <w:rPr>
+          <w:b/>
+          <w:bCs/>
+        </w:rPr>
+        <w:t>MSAL</w:t>
+      </w:r>
+      <w:r>
+        <w:t xml:space="preserve">, or </w:t>
+      </w:r>
+      <w:r>
+        <w:rPr>
+          <w:b/>
+          <w:bCs/>
+        </w:rPr>
+        <w:t>environment configuration errors</w:t>
+      </w:r>
+      <w:r>
+        <w:t>.</w:t>
       </w:r>
     </w:p>
     <w:p>
@@ -740,21 +1831,121 @@
         <w:t>14. Validate GET /api/conversations in the Network tab</w:t>
       </w:r>
       <w:r>
-        <w:t xml:space="preserve"> </w:t>
-      </w:r>
-      <w:r>
-        <w:t xml:space="preserve">– </w:t>
-      </w:r>
-      <w:r>
-        <w:rPr>
-          <w:color w:val="EE0000"/>
-        </w:rPr>
-        <w:t>NOT STARTED</w:t>
+        <w:t xml:space="preserve"> – </w:t>
+      </w:r>
+      <w:r>
+        <w:rPr>
+          <w:color w:val="00B050"/>
+        </w:rPr>
+        <w:t>COMPLETE</w:t>
       </w:r>
     </w:p>
     <w:p>
       <w:r>
-        <w:t>Reload the production page, filter Network requests for conversations, and verify the production site calls the Azure Function endpoint and receives HTTP 200.</w:t>
+        <w:rPr>
+          <w:u w:val="thick"/>
+        </w:rPr>
+        <w:t>Reload</w:t>
+      </w:r>
+      <w:r>
+        <w:t xml:space="preserve"> the </w:t>
+      </w:r>
+      <w:r>
+        <w:rPr>
+          <w:b/>
+          <w:bCs/>
+        </w:rPr>
+        <w:t>production page</w:t>
+      </w:r>
+      <w:r>
+        <w:t xml:space="preserve">, </w:t>
+      </w:r>
+      <w:r>
+        <w:rPr>
+          <w:u w:val="thick"/>
+        </w:rPr>
+        <w:t>filter</w:t>
+      </w:r>
+      <w:r>
+        <w:t xml:space="preserve"> </w:t>
+      </w:r>
+      <w:r>
+        <w:rPr>
+          <w:b/>
+          <w:bCs/>
+        </w:rPr>
+        <w:t>Network requests</w:t>
+      </w:r>
+      <w:r>
+        <w:t xml:space="preserve"> </w:t>
+      </w:r>
+      <w:r>
+        <w:rPr>
+          <w:u w:val="thick"/>
+        </w:rPr>
+        <w:t>for</w:t>
+      </w:r>
+      <w:r>
+        <w:t xml:space="preserve"> </w:t>
+      </w:r>
+      <w:r>
+        <w:rPr>
+          <w:b/>
+          <w:bCs/>
+        </w:rPr>
+        <w:t>conversations</w:t>
+      </w:r>
+      <w:r>
+        <w:t xml:space="preserve">, </w:t>
+      </w:r>
+      <w:r>
+        <w:rPr>
+          <w:u w:val="thick"/>
+        </w:rPr>
+        <w:t>and</w:t>
+      </w:r>
+      <w:r>
+        <w:t xml:space="preserve"> </w:t>
+      </w:r>
+      <w:r>
+        <w:rPr>
+          <w:b/>
+          <w:bCs/>
+        </w:rPr>
+        <w:t>verify</w:t>
+      </w:r>
+      <w:r>
+        <w:t xml:space="preserve"> the </w:t>
+      </w:r>
+      <w:r>
+        <w:rPr>
+          <w:b/>
+          <w:bCs/>
+        </w:rPr>
+        <w:t>production site calls</w:t>
+      </w:r>
+      <w:r>
+        <w:t xml:space="preserve"> the </w:t>
+      </w:r>
+      <w:r>
+        <w:rPr>
+          <w:b/>
+          <w:bCs/>
+        </w:rPr>
+        <w:t>Azure Function endpoint</w:t>
+      </w:r>
+      <w:r>
+        <w:t xml:space="preserve"> and </w:t>
+      </w:r>
+      <w:r>
+        <w:rPr>
+          <w:b/>
+          <w:bCs/>
+        </w:rPr>
+        <w:t>receives HTTP 200</w:t>
+      </w:r>
+      <w:r>
+        <w:t>.</w:t>
       </w:r>
     </w:p>
     <w:p>
@@ -782,21 +1973,150 @@
         <w:t>15. Validate opening an existing conversation</w:t>
       </w:r>
       <w:r>
-        <w:t xml:space="preserve"> </w:t>
-      </w:r>
-      <w:r>
-        <w:t xml:space="preserve">– </w:t>
-      </w:r>
-      <w:r>
-        <w:rPr>
-          <w:color w:val="EE0000"/>
-        </w:rPr>
-        <w:t>NOT STARTED</w:t>
+        <w:t xml:space="preserve"> – </w:t>
+      </w:r>
+      <w:r>
+        <w:rPr>
+          <w:color w:val="00B050"/>
+        </w:rPr>
+        <w:t>COMPLETE</w:t>
       </w:r>
     </w:p>
     <w:p>
       <w:r>
-        <w:t>Click an existing conversation in the sidebar and confirm the browser sends GET /api/conversations/{conversationId} and receives HTTP 200. Verify previous user and assistant messages render correctly.</w:t>
+        <w:rPr>
+          <w:u w:val="thick"/>
+        </w:rPr>
+        <w:t>Click</w:t>
+      </w:r>
+      <w:r>
+        <w:t xml:space="preserve"> an </w:t>
+      </w:r>
+      <w:r>
+        <w:rPr>
+          <w:b/>
+          <w:bCs/>
+        </w:rPr>
+        <w:t>existing conversation</w:t>
+      </w:r>
+      <w:r>
+        <w:t xml:space="preserve"> in the </w:t>
+      </w:r>
+      <w:r>
+        <w:rPr>
+          <w:b/>
+          <w:bCs/>
+        </w:rPr>
+        <w:t>sidebar</w:t>
+      </w:r>
+      <w:r>
+        <w:t xml:space="preserve"> and </w:t>
+      </w:r>
+      <w:r>
+        <w:rPr>
+          <w:b/>
+          <w:bCs/>
+        </w:rPr>
+        <w:t>confirm</w:t>
+      </w:r>
+      <w:r>
+        <w:t xml:space="preserve"> the </w:t>
+      </w:r>
+      <w:r>
+        <w:rPr>
+          <w:b/>
+          <w:bCs/>
+        </w:rPr>
+        <w:t xml:space="preserve">browser </w:t>
+      </w:r>
+      <w:r>
+        <w:rPr>
+          <w:u w:val="thick"/>
+        </w:rPr>
+        <w:t>sends</w:t>
+      </w:r>
+      <w:r>
+        <w:rPr>
+          <w:b/>
+          <w:bCs/>
+        </w:rPr>
+        <w:t xml:space="preserve"> GET</w:t>
+      </w:r>
+      <w:r>
+        <w:t xml:space="preserve"> /api/conversations/{conversationId} </w:t>
+      </w:r>
+      <w:r>
+        <w:rPr>
+          <w:u w:val="thick"/>
+        </w:rPr>
+        <w:t>and</w:t>
+      </w:r>
+      <w:r>
+        <w:t xml:space="preserve"> </w:t>
+      </w:r>
+      <w:r>
+        <w:rPr>
+          <w:b/>
+          <w:bCs/>
+        </w:rPr>
+        <w:t>receives HTTP 200</w:t>
+      </w:r>
+      <w:r>
+        <w:t xml:space="preserve">. </w:t>
+      </w:r>
+      <w:r>
+        <w:rPr>
+          <w:u w:val="thick"/>
+        </w:rPr>
+        <w:t>Verify</w:t>
+      </w:r>
+      <w:r>
+        <w:t xml:space="preserve"> </w:t>
+      </w:r>
+      <w:r>
+        <w:rPr>
+          <w:u w:val="thick"/>
+        </w:rPr>
+        <w:t>previous</w:t>
+      </w:r>
+      <w:r>
+        <w:t xml:space="preserve"> </w:t>
+      </w:r>
+      <w:r>
+        <w:rPr>
+          <w:b/>
+          <w:bCs/>
+        </w:rPr>
+        <w:t>user</w:t>
+      </w:r>
+      <w:r>
+        <w:t xml:space="preserve"> and </w:t>
+      </w:r>
+      <w:r>
+        <w:rPr>
+          <w:b/>
+          <w:bCs/>
+        </w:rPr>
+        <w:t>assistant messages</w:t>
+      </w:r>
+      <w:r>
+        <w:t xml:space="preserve"> </w:t>
+      </w:r>
+      <w:r>
+        <w:rPr>
+          <w:b/>
+          <w:bCs/>
+        </w:rPr>
+        <w:t xml:space="preserve">render </w:t>
+      </w:r>
+      <w:r>
+        <w:rPr>
+          <w:u w:val="thick"/>
+        </w:rPr>
+        <w:t>correctly</w:t>
+      </w:r>
+      <w:r>
+        <w:t>.</w:t>
       </w:r>
     </w:p>
     <w:p>
@@ -807,21 +2127,120 @@
         <w:t>16. Validate creating a new chat</w:t>
       </w:r>
       <w:r>
-        <w:t xml:space="preserve"> </w:t>
-      </w:r>
-      <w:r>
-        <w:t xml:space="preserve">– </w:t>
-      </w:r>
-      <w:r>
-        <w:rPr>
-          <w:color w:val="EE0000"/>
-        </w:rPr>
-        <w:t>NOT STARTED</w:t>
+        <w:t xml:space="preserve"> – </w:t>
+      </w:r>
+      <w:r>
+        <w:rPr>
+          <w:color w:val="00B050"/>
+        </w:rPr>
+        <w:t>COMPLETE</w:t>
       </w:r>
     </w:p>
     <w:p>
       <w:r>
-        <w:t>Click New Chat, send a production test question, and verify POST /api/policy-chat returns HTTP 200 with a new conversationId and assistant answer.</w:t>
+        <w:rPr>
+          <w:u w:val="thick"/>
+        </w:rPr>
+        <w:t>Click</w:t>
+      </w:r>
+      <w:r>
+        <w:t xml:space="preserve"> </w:t>
+      </w:r>
+      <w:r>
+        <w:rPr>
+          <w:b/>
+          <w:bCs/>
+        </w:rPr>
+        <w:t>New Chat</w:t>
+      </w:r>
+      <w:r>
+        <w:t xml:space="preserve">, </w:t>
+      </w:r>
+      <w:r>
+        <w:rPr>
+          <w:u w:val="thick"/>
+        </w:rPr>
+        <w:t>send</w:t>
+      </w:r>
+      <w:r>
+        <w:t xml:space="preserve"> a </w:t>
+      </w:r>
+      <w:r>
+        <w:rPr>
+          <w:b/>
+          <w:bCs/>
+        </w:rPr>
+        <w:t>production test question</w:t>
+      </w:r>
+      <w:r>
+        <w:t xml:space="preserve">, and </w:t>
+      </w:r>
+      <w:r>
+        <w:rPr>
+          <w:u w:val="thick"/>
+        </w:rPr>
+        <w:t>verify</w:t>
+      </w:r>
+      <w:r>
+        <w:t xml:space="preserve"> </w:t>
+      </w:r>
+      <w:r>
+        <w:rPr>
+          <w:b/>
+          <w:bCs/>
+        </w:rPr>
+        <w:t xml:space="preserve">POST </w:t>
+      </w:r>
+      <w:r>
+        <w:t xml:space="preserve">/api/policy-chat </w:t>
+      </w:r>
+      <w:r>
+        <w:rPr>
+          <w:u w:val="thick"/>
+        </w:rPr>
+        <w:t>returns</w:t>
+      </w:r>
+      <w:r>
+        <w:t xml:space="preserve"> </w:t>
+      </w:r>
+      <w:r>
+        <w:rPr>
+          <w:b/>
+          <w:bCs/>
+        </w:rPr>
+        <w:t>HTTP 200</w:t>
+      </w:r>
+      <w:r>
+        <w:t xml:space="preserve"> </w:t>
+      </w:r>
+      <w:r>
+        <w:rPr>
+          <w:u w:val="thick"/>
+        </w:rPr>
+        <w:t>with</w:t>
+      </w:r>
+      <w:r>
+        <w:t xml:space="preserve"> a </w:t>
+      </w:r>
+      <w:r>
+        <w:rPr>
+          <w:b/>
+          <w:bCs/>
+        </w:rPr>
+        <w:t>new conversationId</w:t>
+      </w:r>
+      <w:r>
+        <w:t xml:space="preserve"> and </w:t>
+      </w:r>
+      <w:r>
+        <w:rPr>
+          <w:b/>
+          <w:bCs/>
+        </w:rPr>
+        <w:t>assistant answer</w:t>
+      </w:r>
+      <w:r>
+        <w:t>.</w:t>
       </w:r>
     </w:p>
     <w:p>
@@ -863,21 +2282,102 @@
         <w:t>17. Verify the browser sends the bearer token</w:t>
       </w:r>
       <w:r>
-        <w:t xml:space="preserve"> </w:t>
-      </w:r>
-      <w:r>
-        <w:t xml:space="preserve">– </w:t>
-      </w:r>
-      <w:r>
-        <w:rPr>
-          <w:color w:val="EE0000"/>
-        </w:rPr>
-        <w:t>NOT STARTED</w:t>
+        <w:t xml:space="preserve"> – </w:t>
+      </w:r>
+      <w:r>
+        <w:rPr>
+          <w:color w:val="00B050"/>
+        </w:rPr>
+        <w:t>COMPLETE</w:t>
       </w:r>
     </w:p>
     <w:p>
       <w:r>
-        <w:t>In Developer Tools &gt; Network &gt; policy-chat &gt; Headers, confirm the request includes an Authorization header. Do not copy, publish, or store the actual bearer token.</w:t>
+        <w:t xml:space="preserve">In </w:t>
+      </w:r>
+      <w:r>
+        <w:rPr>
+          <w:b/>
+          <w:bCs/>
+        </w:rPr>
+        <w:t>Developer Tools &gt; Network &gt; policy-chat &gt; Headers</w:t>
+      </w:r>
+      <w:r>
+        <w:t xml:space="preserve">, </w:t>
+      </w:r>
+      <w:r>
+        <w:rPr>
+          <w:u w:val="thick"/>
+        </w:rPr>
+        <w:t>confirm</w:t>
+      </w:r>
+      <w:r>
+        <w:t xml:space="preserve"> the </w:t>
+      </w:r>
+      <w:r>
+        <w:rPr>
+          <w:b/>
+          <w:bCs/>
+        </w:rPr>
+        <w:t>request</w:t>
+      </w:r>
+      <w:r>
+        <w:t xml:space="preserve"> </w:t>
+      </w:r>
+      <w:r>
+        <w:rPr>
+          <w:u w:val="thick"/>
+        </w:rPr>
+        <w:t>includes</w:t>
+      </w:r>
+      <w:r>
+        <w:t xml:space="preserve"> an </w:t>
+      </w:r>
+      <w:r>
+        <w:rPr>
+          <w:b/>
+          <w:bCs/>
+        </w:rPr>
+        <w:t>Authorization header</w:t>
+      </w:r>
+      <w:r>
+        <w:t xml:space="preserve">. </w:t>
+      </w:r>
+      <w:r>
+        <w:rPr>
+          <w:u w:val="thick"/>
+        </w:rPr>
+        <w:t>Do not</w:t>
+      </w:r>
+      <w:r>
+        <w:rPr>
+          <w:b/>
+          <w:bCs/>
+        </w:rPr>
+        <w:t xml:space="preserve"> copy, publish</w:t>
+      </w:r>
+      <w:r>
+        <w:t xml:space="preserve">, or </w:t>
+      </w:r>
+      <w:r>
+        <w:rPr>
+          <w:b/>
+          <w:bCs/>
+        </w:rPr>
+        <w:t>store</w:t>
+      </w:r>
+      <w:r>
+        <w:t xml:space="preserve"> the </w:t>
+      </w:r>
+      <w:r>
+        <w:rPr>
+          <w:b/>
+          <w:bCs/>
+        </w:rPr>
+        <w:t>actual bearer token</w:t>
+      </w:r>
+      <w:r>
+        <w:t>.</w:t>
       </w:r>
     </w:p>
     <w:p>
@@ -892,26 +2392,83 @@
     <w:p>
       <w:pPr>
         <w:pStyle w:val="Heading1"/>
+        <w:rPr>
+          <w:color w:val="EE0000"/>
+        </w:rPr>
       </w:pPr>
       <w:r>
         <w:t>18. Verify the production access-token claims when troubleshooting</w:t>
       </w:r>
       <w:r>
+        <w:t xml:space="preserve"> – </w:t>
+      </w:r>
+      <w:r>
+        <w:rPr>
+          <w:color w:val="EE0000"/>
+        </w:rPr>
+        <w:t>Verify the production access-token claims — IN PROGRESS</w:t>
+      </w:r>
+      <w:r>
+        <w:rPr>
+          <w:color w:val="EE0000"/>
+        </w:rPr>
         <w:t xml:space="preserve"> </w:t>
-      </w:r>
-      <w:r>
-        <w:t xml:space="preserve">– </w:t>
-      </w:r>
-      <w:r>
-        <w:rPr>
-          <w:color w:val="EE0000"/>
-        </w:rPr>
-        <w:t>NOT STARTED</w:t>
       </w:r>
     </w:p>
     <w:p>
       <w:r>
-        <w:t>If needed, inspect the JWT payload and confirm the API audience, delegated scope, and tenant are correct.</w:t>
+        <w:t xml:space="preserve">If needed, </w:t>
+      </w:r>
+      <w:r>
+        <w:rPr>
+          <w:u w:val="thick"/>
+        </w:rPr>
+        <w:t>inspect</w:t>
+      </w:r>
+      <w:r>
+        <w:t xml:space="preserve"> the </w:t>
+      </w:r>
+      <w:r>
+        <w:t>JWT payload</w:t>
+      </w:r>
+      <w:r>
+        <w:t xml:space="preserve"> and </w:t>
+      </w:r>
+      <w:r>
+        <w:rPr>
+          <w:u w:val="thick"/>
+        </w:rPr>
+        <w:t>confirm</w:t>
+      </w:r>
+      <w:r>
+        <w:t xml:space="preserve"> the </w:t>
+      </w:r>
+      <w:r>
+        <w:t>API audience</w:t>
+      </w:r>
+      <w:r>
+        <w:t xml:space="preserve">, </w:t>
+      </w:r>
+      <w:r>
+        <w:t>delegated scope</w:t>
+      </w:r>
+      <w:r>
+        <w:t xml:space="preserve">, and </w:t>
+      </w:r>
+      <w:r>
+        <w:t xml:space="preserve">tenant </w:t>
+      </w:r>
+      <w:r>
+        <w:t xml:space="preserve">are </w:t>
+      </w:r>
+      <w:r>
+        <w:rPr>
+          <w:u w:val="thick"/>
+        </w:rPr>
+        <w:t>correct</w:t>
+      </w:r>
+      <w:r>
+        <w:t>.</w:t>
       </w:r>
     </w:p>
     <w:p>
@@ -933,7 +2490,55 @@
     </w:p>
     <w:p>
       <w:r>
-        <w:t>The scope must be access_policy_assistant, not test_policy_assistant.</w:t>
+        <w:t xml:space="preserve">The </w:t>
+      </w:r>
+      <w:r>
+        <w:rPr>
+          <w:b/>
+          <w:bCs/>
+        </w:rPr>
+        <w:t>scope</w:t>
+      </w:r>
+      <w:r>
+        <w:t xml:space="preserve"> </w:t>
+      </w:r>
+      <w:r>
+        <w:rPr>
+          <w:u w:val="thick"/>
+        </w:rPr>
+        <w:t>must</w:t>
+      </w:r>
+      <w:r>
+        <w:t xml:space="preserve"> be </w:t>
+      </w:r>
+      <w:r>
+        <w:rPr>
+          <w:b/>
+          <w:bCs/>
+        </w:rPr>
+        <w:t>access_policy_assistant</w:t>
+      </w:r>
+      <w:r>
+        <w:t xml:space="preserve">, </w:t>
+      </w:r>
+      <w:r>
+        <w:rPr>
+          <w:u w:val="thick"/>
+        </w:rPr>
+        <w:t>not</w:t>
+      </w:r>
+      <w:r>
+        <w:t xml:space="preserve"> </w:t>
+      </w:r>
+      <w:r>
+        <w:rPr>
+          <w:b/>
+          <w:bCs/>
+        </w:rPr>
+        <w:t>test_policy_assistant</w:t>
+      </w:r>
+      <w:r>
+        <w:t>.</w:t>
       </w:r>
     </w:p>
     <w:p>
@@ -944,21 +2549,150 @@
         <w:t>19. Validate persistence after refresh</w:t>
       </w:r>
       <w:r>
-        <w:t xml:space="preserve"> </w:t>
-      </w:r>
-      <w:r>
-        <w:t xml:space="preserve">– </w:t>
-      </w:r>
-      <w:r>
-        <w:rPr>
-          <w:color w:val="EE0000"/>
-        </w:rPr>
-        <w:t>NOT STARTED</w:t>
+        <w:t xml:space="preserve"> – </w:t>
+      </w:r>
+      <w:r>
+        <w:rPr>
+          <w:color w:val="00B050"/>
+        </w:rPr>
+        <w:t>COMPLETE</w:t>
       </w:r>
     </w:p>
     <w:p>
       <w:r>
-        <w:t>Create a new conversation, send a message, refresh the production page, and confirm GET /api/conversations runs again. Reopen the new conversation and verify its messages are returned by GET /api/conversations/{conversationId}.</w:t>
+        <w:rPr>
+          <w:u w:val="thick"/>
+        </w:rPr>
+        <w:t>Create</w:t>
+      </w:r>
+      <w:r>
+        <w:t xml:space="preserve"> a new </w:t>
+      </w:r>
+      <w:r>
+        <w:rPr>
+          <w:b/>
+          <w:bCs/>
+        </w:rPr>
+        <w:t>conversation</w:t>
+      </w:r>
+      <w:r>
+        <w:t xml:space="preserve">, </w:t>
+      </w:r>
+      <w:r>
+        <w:rPr>
+          <w:b/>
+          <w:bCs/>
+        </w:rPr>
+        <w:t>send a message</w:t>
+      </w:r>
+      <w:r>
+        <w:t xml:space="preserve">, </w:t>
+      </w:r>
+      <w:r>
+        <w:rPr>
+          <w:u w:val="thick"/>
+        </w:rPr>
+        <w:t>refresh</w:t>
+      </w:r>
+      <w:r>
+        <w:t xml:space="preserve"> the </w:t>
+      </w:r>
+      <w:r>
+        <w:rPr>
+          <w:b/>
+          <w:bCs/>
+        </w:rPr>
+        <w:t>production page</w:t>
+      </w:r>
+      <w:r>
+        <w:t xml:space="preserve">, and </w:t>
+      </w:r>
+      <w:r>
+        <w:rPr>
+          <w:u w:val="thick"/>
+        </w:rPr>
+        <w:t>confirm</w:t>
+      </w:r>
+      <w:r>
+        <w:t xml:space="preserve"> </w:t>
+      </w:r>
+      <w:r>
+        <w:rPr>
+          <w:b/>
+          <w:bCs/>
+        </w:rPr>
+        <w:t>GET</w:t>
+      </w:r>
+      <w:r>
+        <w:t xml:space="preserve"> /api/conversations </w:t>
+      </w:r>
+      <w:r>
+        <w:rPr>
+          <w:b/>
+          <w:bCs/>
+        </w:rPr>
+        <w:t>runs again</w:t>
+      </w:r>
+      <w:r>
+        <w:t xml:space="preserve">. </w:t>
+      </w:r>
+      <w:r>
+        <w:rPr>
+          <w:u w:val="thick"/>
+        </w:rPr>
+        <w:t>Reopen</w:t>
+      </w:r>
+      <w:r>
+        <w:t xml:space="preserve"> the </w:t>
+      </w:r>
+      <w:r>
+        <w:rPr>
+          <w:b/>
+          <w:bCs/>
+        </w:rPr>
+        <w:t>new conversation</w:t>
+      </w:r>
+      <w:r>
+        <w:t xml:space="preserve"> and </w:t>
+      </w:r>
+      <w:r>
+        <w:rPr>
+          <w:b/>
+          <w:bCs/>
+        </w:rPr>
+        <w:t>verify</w:t>
+      </w:r>
+      <w:r>
+        <w:t xml:space="preserve"> its </w:t>
+      </w:r>
+      <w:r>
+        <w:rPr>
+          <w:b/>
+          <w:bCs/>
+        </w:rPr>
+        <w:t>messages</w:t>
+      </w:r>
+      <w:r>
+        <w:t xml:space="preserve"> are </w:t>
+      </w:r>
+      <w:r>
+        <w:rPr>
+          <w:u w:val="thick"/>
+        </w:rPr>
+        <w:t>returned</w:t>
+      </w:r>
+      <w:r>
+        <w:t xml:space="preserve"> by </w:t>
+      </w:r>
+      <w:r>
+        <w:rPr>
+          <w:b/>
+          <w:bCs/>
+        </w:rPr>
+        <w:t xml:space="preserve">GET </w:t>
+      </w:r>
+      <w:r>
+        <w:t>/api/conversations/{conversationId}.</w:t>
       </w:r>
     </w:p>
     <w:p>
@@ -969,21 +2703,129 @@
         <w:t>20. Validate continued conversation behavior</w:t>
       </w:r>
       <w:r>
-        <w:t xml:space="preserve"> </w:t>
-      </w:r>
-      <w:r>
-        <w:t xml:space="preserve">– </w:t>
-      </w:r>
-      <w:r>
-        <w:rPr>
-          <w:color w:val="EE0000"/>
-        </w:rPr>
-        <w:t>NOT STARTED</w:t>
+        <w:t xml:space="preserve"> – </w:t>
+      </w:r>
+      <w:r>
+        <w:rPr>
+          <w:color w:val="00B050"/>
+        </w:rPr>
+        <w:t>COMPLETE</w:t>
       </w:r>
     </w:p>
     <w:p>
       <w:r>
-        <w:t>Open an existing conversation and send another prompt. Confirm the request body contains the existing conversationId and the response returns the same conversationId.</w:t>
+        <w:rPr>
+          <w:u w:val="thick"/>
+        </w:rPr>
+        <w:t>Open</w:t>
+      </w:r>
+      <w:r>
+        <w:t xml:space="preserve"> an </w:t>
+      </w:r>
+      <w:r>
+        <w:rPr>
+          <w:b/>
+          <w:bCs/>
+        </w:rPr>
+        <w:t>existing conversation</w:t>
+      </w:r>
+      <w:r>
+        <w:t xml:space="preserve"> and </w:t>
+      </w:r>
+      <w:r>
+        <w:rPr>
+          <w:b/>
+          <w:bCs/>
+        </w:rPr>
+        <w:t>send another prompt</w:t>
+      </w:r>
+      <w:r>
+        <w:t xml:space="preserve">. </w:t>
+      </w:r>
+      <w:r>
+        <w:rPr>
+          <w:u w:val="thick"/>
+        </w:rPr>
+        <w:t>Confirm</w:t>
+      </w:r>
+      <w:r>
+        <w:t xml:space="preserve"> the </w:t>
+      </w:r>
+      <w:r>
+        <w:rPr>
+          <w:b/>
+          <w:bCs/>
+        </w:rPr>
+        <w:t>request body</w:t>
+      </w:r>
+      <w:r>
+        <w:t xml:space="preserve"> </w:t>
+      </w:r>
+      <w:r>
+        <w:rPr>
+          <w:u w:val="thick"/>
+        </w:rPr>
+        <w:t>contains</w:t>
+      </w:r>
+      <w:r>
+        <w:t xml:space="preserve"> the </w:t>
+      </w:r>
+      <w:r>
+        <w:rPr>
+          <w:u w:val="thick"/>
+        </w:rPr>
+        <w:t>existing</w:t>
+      </w:r>
+      <w:r>
+        <w:t xml:space="preserve"> </w:t>
+      </w:r>
+      <w:r>
+        <w:rPr>
+          <w:b/>
+          <w:bCs/>
+        </w:rPr>
+        <w:t>conversationId</w:t>
+      </w:r>
+      <w:r>
+        <w:t xml:space="preserve"> </w:t>
+      </w:r>
+      <w:r>
+        <w:rPr>
+          <w:u w:val="thick"/>
+        </w:rPr>
+        <w:t>and</w:t>
+      </w:r>
+      <w:r>
+        <w:t xml:space="preserve"> the </w:t>
+      </w:r>
+      <w:r>
+        <w:rPr>
+          <w:b/>
+          <w:bCs/>
+        </w:rPr>
+        <w:t>response</w:t>
+      </w:r>
+      <w:r>
+        <w:t xml:space="preserve"> </w:t>
+      </w:r>
+      <w:r>
+        <w:rPr>
+          <w:u w:val="thick"/>
+        </w:rPr>
+        <w:t>returns</w:t>
+      </w:r>
+      <w:r>
+        <w:t xml:space="preserve"> the </w:t>
+      </w:r>
+      <w:r>
+        <w:rPr>
+          <w:b/>
+          <w:bCs/>
+        </w:rPr>
+        <w:t>same conversationId</w:t>
+      </w:r>
+      <w:r>
+        <w:t>.</w:t>
       </w:r>
     </w:p>
     <w:p>
@@ -1016,21 +2858,175 @@
         <w:t>21. Validate New Chat behavior</w:t>
       </w:r>
       <w:r>
-        <w:t xml:space="preserve"> </w:t>
-      </w:r>
-      <w:r>
-        <w:t xml:space="preserve">– </w:t>
-      </w:r>
-      <w:r>
-        <w:rPr>
-          <w:color w:val="EE0000"/>
-        </w:rPr>
-        <w:t>NOT STARTED</w:t>
+        <w:t xml:space="preserve"> – </w:t>
+      </w:r>
+      <w:r>
+        <w:rPr>
+          <w:color w:val="00B050"/>
+        </w:rPr>
+        <w:t>COMPLETE</w:t>
       </w:r>
     </w:p>
     <w:p>
       <w:r>
-        <w:t>Click New Chat and send the first message. Confirm the client sends an empty conversationId and that the backend returns a new ID different from the previously selected conversation.</w:t>
+        <w:rPr>
+          <w:u w:val="thick"/>
+        </w:rPr>
+        <w:t>Click</w:t>
+      </w:r>
+      <w:r>
+        <w:t xml:space="preserve"> </w:t>
+      </w:r>
+      <w:r>
+        <w:rPr>
+          <w:b/>
+          <w:bCs/>
+        </w:rPr>
+        <w:t>New Chat</w:t>
+      </w:r>
+      <w:r>
+        <w:t xml:space="preserve"> </w:t>
+      </w:r>
+      <w:r>
+        <w:rPr>
+          <w:u w:val="thick"/>
+        </w:rPr>
+        <w:t>and</w:t>
+      </w:r>
+      <w:r>
+        <w:t xml:space="preserve"> </w:t>
+      </w:r>
+      <w:r>
+        <w:rPr>
+          <w:b/>
+          <w:bCs/>
+        </w:rPr>
+        <w:t>send</w:t>
+      </w:r>
+      <w:r>
+        <w:t xml:space="preserve"> the </w:t>
+      </w:r>
+      <w:r>
+        <w:rPr>
+          <w:b/>
+          <w:bCs/>
+        </w:rPr>
+        <w:t>first message</w:t>
+      </w:r>
+      <w:r>
+        <w:t xml:space="preserve">. </w:t>
+      </w:r>
+      <w:r>
+        <w:rPr>
+          <w:u w:val="thick"/>
+        </w:rPr>
+        <w:t>Confirm</w:t>
+      </w:r>
+      <w:r>
+        <w:t xml:space="preserve"> the </w:t>
+      </w:r>
+      <w:r>
+        <w:rPr>
+          <w:b/>
+          <w:bCs/>
+        </w:rPr>
+        <w:t>client sends</w:t>
+      </w:r>
+      <w:r>
+        <w:t xml:space="preserve"> an </w:t>
+      </w:r>
+      <w:r>
+        <w:rPr>
+          <w:b/>
+          <w:bCs/>
+        </w:rPr>
+        <w:t>empty conversationId</w:t>
+      </w:r>
+      <w:r>
+        <w:t xml:space="preserve"> </w:t>
+      </w:r>
+      <w:r>
+        <w:rPr>
+          <w:u w:val="thick"/>
+        </w:rPr>
+        <w:t>and</w:t>
+      </w:r>
+      <w:r>
+        <w:t xml:space="preserve"> that the </w:t>
+      </w:r>
+      <w:r>
+        <w:rPr>
+          <w:b/>
+          <w:bCs/>
+        </w:rPr>
+        <w:t xml:space="preserve">backend </w:t>
+      </w:r>
+      <w:r>
+        <w:rPr>
+          <w:u w:val="thick"/>
+        </w:rPr>
+        <w:t>returns</w:t>
+      </w:r>
+      <w:r>
+        <w:rPr>
+          <w:b/>
+          <w:bCs/>
+        </w:rPr>
+        <w:t xml:space="preserve"> </w:t>
+      </w:r>
+      <w:r>
+        <w:t>a</w:t>
+      </w:r>
+      <w:r>
+        <w:rPr>
+          <w:b/>
+          <w:bCs/>
+        </w:rPr>
+        <w:t xml:space="preserve"> new ID</w:t>
+      </w:r>
+      <w:r>
+        <w:t xml:space="preserve"> </w:t>
+      </w:r>
+      <w:r>
+        <w:rPr>
+          <w:u w:val="thick"/>
+        </w:rPr>
+        <w:t>different</w:t>
+      </w:r>
+      <w:r>
+        <w:t xml:space="preserve"> </w:t>
+      </w:r>
+      <w:r>
+        <w:rPr>
+          <w:u w:val="single"/>
+        </w:rPr>
+        <w:t>from</w:t>
+      </w:r>
+      <w:r>
+        <w:t xml:space="preserve"> the </w:t>
+      </w:r>
+      <w:r>
+        <w:rPr>
+          <w:b/>
+          <w:bCs/>
+        </w:rPr>
+        <w:t xml:space="preserve">previously </w:t>
+      </w:r>
+      <w:r>
+        <w:rPr>
+          <w:u w:val="thick"/>
+        </w:rPr>
+        <w:t>selected</w:t>
+      </w:r>
+      <w:r>
+        <w:rPr>
+          <w:b/>
+          <w:bCs/>
+        </w:rPr>
+        <w:t xml:space="preserve"> conversation</w:t>
+      </w:r>
+      <w:r>
+        <w:t>.</w:t>
       </w:r>
     </w:p>
     <w:p>
@@ -1062,21 +3058,126 @@
         <w:t>22. Perform a negative CORS check</w:t>
       </w:r>
       <w:r>
-        <w:t xml:space="preserve"> </w:t>
-      </w:r>
-      <w:r>
-        <w:t xml:space="preserve">– </w:t>
-      </w:r>
-      <w:r>
-        <w:rPr>
-          <w:color w:val="EE0000"/>
-        </w:rPr>
-        <w:t>NOT STARTED</w:t>
+        <w:t xml:space="preserve"> – </w:t>
+      </w:r>
+      <w:r>
+        <w:rPr>
+          <w:color w:val="00B050"/>
+        </w:rPr>
+        <w:t>COMPLETE</w:t>
       </w:r>
     </w:p>
     <w:p>
       <w:r>
-        <w:t>Optionally verify that an unapproved browser origin cannot call the Function App. Confirm Azure CORS contains only the intended origins and not a permissive wildcard.</w:t>
+        <w:rPr>
+          <w:u w:val="thick"/>
+        </w:rPr>
+        <w:t>Optionally</w:t>
+      </w:r>
+      <w:r>
+        <w:t xml:space="preserve"> </w:t>
+      </w:r>
+      <w:r>
+        <w:rPr>
+          <w:b/>
+          <w:bCs/>
+        </w:rPr>
+        <w:t>verify</w:t>
+      </w:r>
+      <w:r>
+        <w:t xml:space="preserve"> that an </w:t>
+      </w:r>
+      <w:r>
+        <w:rPr>
+          <w:b/>
+          <w:bCs/>
+        </w:rPr>
+        <w:t xml:space="preserve">unapproved browser origin </w:t>
+      </w:r>
+      <w:r>
+        <w:rPr>
+          <w:u w:val="thick"/>
+        </w:rPr>
+        <w:t>cannot</w:t>
+      </w:r>
+      <w:r>
+        <w:t xml:space="preserve"> </w:t>
+      </w:r>
+      <w:r>
+        <w:rPr>
+          <w:u w:val="thick"/>
+        </w:rPr>
+        <w:t>call</w:t>
+      </w:r>
+      <w:r>
+        <w:t xml:space="preserve"> the </w:t>
+      </w:r>
+      <w:r>
+        <w:rPr>
+          <w:b/>
+          <w:bCs/>
+        </w:rPr>
+        <w:t>Function App</w:t>
+      </w:r>
+      <w:r>
+        <w:t xml:space="preserve">. </w:t>
+      </w:r>
+      <w:r>
+        <w:rPr>
+          <w:u w:val="thick"/>
+        </w:rPr>
+        <w:t>Confirm</w:t>
+      </w:r>
+      <w:r>
+        <w:t xml:space="preserve"> </w:t>
+      </w:r>
+      <w:r>
+        <w:rPr>
+          <w:b/>
+          <w:bCs/>
+        </w:rPr>
+        <w:t>Azure CORS</w:t>
+      </w:r>
+      <w:r>
+        <w:t xml:space="preserve"> </w:t>
+      </w:r>
+      <w:r>
+        <w:rPr>
+          <w:u w:val="thick"/>
+        </w:rPr>
+        <w:t>contains only</w:t>
+      </w:r>
+      <w:r>
+        <w:t xml:space="preserve"> the </w:t>
+      </w:r>
+      <w:r>
+        <w:rPr>
+          <w:b/>
+          <w:bCs/>
+        </w:rPr>
+        <w:t>intended origins</w:t>
+      </w:r>
+      <w:r>
+        <w:t xml:space="preserve"> </w:t>
+      </w:r>
+      <w:r>
+        <w:rPr>
+          <w:u w:val="thick"/>
+        </w:rPr>
+        <w:t>and not</w:t>
+      </w:r>
+      <w:r>
+        <w:t xml:space="preserve"> a </w:t>
+      </w:r>
+      <w:r>
+        <w:rPr>
+          <w:b/>
+          <w:bCs/>
+        </w:rPr>
+        <w:t>permissive wildcard</w:t>
+      </w:r>
+      <w:r>
+        <w:t>.</w:t>
       </w:r>
     </w:p>
     <w:p>
@@ -1087,29 +3188,132 @@
         <w:t>23. Check the production bundle for localhost references</w:t>
       </w:r>
       <w:r>
-        <w:t xml:space="preserve"> </w:t>
-      </w:r>
-      <w:r>
-        <w:t xml:space="preserve">– </w:t>
-      </w:r>
-      <w:r>
-        <w:rPr>
-          <w:color w:val="EE0000"/>
-        </w:rPr>
-        <w:t>NOT STARTED</w:t>
+        <w:t xml:space="preserve"> – </w:t>
+      </w:r>
+      <w:r>
+        <w:rPr>
+          <w:color w:val="00B050"/>
+        </w:rPr>
+        <w:t>COMPLETE</w:t>
       </w:r>
     </w:p>
     <w:p>
       <w:r>
-        <w:t xml:space="preserve">Search the built output for </w:t>
-      </w:r>
-      <w:proofErr w:type="gramStart"/>
-      <w:r>
+        <w:rPr>
+          <w:u w:val="thick"/>
+        </w:rPr>
+        <w:t>Search</w:t>
+      </w:r>
+      <w:r>
+        <w:t xml:space="preserve"> the </w:t>
+      </w:r>
+      <w:r>
+        <w:rPr>
+          <w:b/>
+          <w:bCs/>
+        </w:rPr>
+        <w:t>built output</w:t>
+      </w:r>
+      <w:r>
+        <w:t xml:space="preserve"> for </w:t>
+      </w:r>
+      <w:r>
+        <w:rPr>
+          <w:b/>
+          <w:bCs/>
+        </w:rPr>
         <w:t>localhost</w:t>
       </w:r>
-      <w:proofErr w:type="gramEnd"/>
-      <w:r>
-        <w:t xml:space="preserve"> and review any matches. Production API configuration should not point to localhost:7071 or another local backend.</w:t>
+      <w:r>
+        <w:t xml:space="preserve"> </w:t>
+      </w:r>
+      <w:r>
+        <w:rPr>
+          <w:u w:val="thick"/>
+        </w:rPr>
+        <w:t>and</w:t>
+      </w:r>
+      <w:r>
+        <w:t xml:space="preserve"> </w:t>
+      </w:r>
+      <w:r>
+        <w:rPr>
+          <w:b/>
+          <w:bCs/>
+        </w:rPr>
+        <w:t>review</w:t>
+      </w:r>
+      <w:r>
+        <w:t xml:space="preserve"> </w:t>
+      </w:r>
+      <w:r>
+        <w:t>any</w:t>
+      </w:r>
+      <w:r>
+        <w:t xml:space="preserve"> </w:t>
+      </w:r>
+      <w:r>
+        <w:rPr>
+          <w:b/>
+          <w:bCs/>
+        </w:rPr>
+        <w:t>matches</w:t>
+      </w:r>
+      <w:r>
+        <w:t xml:space="preserve">. </w:t>
+      </w:r>
+      <w:r>
+        <w:rPr>
+          <w:b/>
+          <w:bCs/>
+        </w:rPr>
+        <w:t>Production API configuration</w:t>
+      </w:r>
+      <w:r>
+        <w:t xml:space="preserve"> </w:t>
+      </w:r>
+      <w:r>
+        <w:rPr>
+          <w:u w:val="thick"/>
+        </w:rPr>
+        <w:t>should</w:t>
+      </w:r>
+      <w:r>
+        <w:t xml:space="preserve"> </w:t>
+      </w:r>
+      <w:r>
+        <w:rPr>
+          <w:u w:val="thick"/>
+        </w:rPr>
+        <w:t>not point</w:t>
+      </w:r>
+      <w:r>
+        <w:t xml:space="preserve"> </w:t>
+      </w:r>
+      <w:r>
+        <w:rPr>
+          <w:u w:val="thick"/>
+        </w:rPr>
+        <w:t>to</w:t>
+      </w:r>
+      <w:r>
+        <w:t xml:space="preserve"> localhost:7071 </w:t>
+      </w:r>
+      <w:r>
+        <w:rPr>
+          <w:u w:val="thick"/>
+        </w:rPr>
+        <w:t>or</w:t>
+      </w:r>
+      <w:r>
+        <w:t xml:space="preserve"> </w:t>
+      </w:r>
+      <w:r>
+        <w:rPr>
+          <w:b/>
+          <w:bCs/>
+        </w:rPr>
+        <w:t>another local backend.</w:t>
       </w:r>
     </w:p>
     <w:p>
@@ -1133,21 +3337,82 @@
         <w:t>24. Check the production bundle for obsolete scope or local API references</w:t>
       </w:r>
       <w:r>
-        <w:t xml:space="preserve"> </w:t>
-      </w:r>
-      <w:r>
-        <w:t xml:space="preserve">– </w:t>
-      </w:r>
-      <w:r>
-        <w:rPr>
-          <w:color w:val="EE0000"/>
-        </w:rPr>
-        <w:t>NOT STARTED</w:t>
+        <w:t xml:space="preserve"> – </w:t>
+      </w:r>
+      <w:r>
+        <w:rPr>
+          <w:color w:val="00B050"/>
+        </w:rPr>
+        <w:t>COMPLETE</w:t>
       </w:r>
     </w:p>
     <w:p>
       <w:r>
-        <w:t>Run targeted searches to make sure the old test scope and local Azure Functions URL are not active in the production bundle.</w:t>
+        <w:rPr>
+          <w:u w:val="thick"/>
+        </w:rPr>
+        <w:t>Run</w:t>
+      </w:r>
+      <w:r>
+        <w:t xml:space="preserve"> </w:t>
+      </w:r>
+      <w:r>
+        <w:rPr>
+          <w:b/>
+          <w:bCs/>
+        </w:rPr>
+        <w:t>targeted searches</w:t>
+      </w:r>
+      <w:r>
+        <w:t xml:space="preserve"> to </w:t>
+      </w:r>
+      <w:r>
+        <w:rPr>
+          <w:u w:val="thick"/>
+        </w:rPr>
+        <w:t>make sure</w:t>
+      </w:r>
+      <w:r>
+        <w:t xml:space="preserve"> the </w:t>
+      </w:r>
+      <w:r>
+        <w:rPr>
+          <w:b/>
+          <w:bCs/>
+        </w:rPr>
+        <w:t>old test scope</w:t>
+      </w:r>
+      <w:r>
+        <w:t xml:space="preserve"> and </w:t>
+      </w:r>
+      <w:r>
+        <w:rPr>
+          <w:b/>
+          <w:bCs/>
+        </w:rPr>
+        <w:t>local Azure Functions URL</w:t>
+      </w:r>
+      <w:r>
+        <w:t xml:space="preserve"> are </w:t>
+      </w:r>
+      <w:r>
+        <w:rPr>
+          <w:u w:val="thick"/>
+        </w:rPr>
+        <w:t>not active</w:t>
+      </w:r>
+      <w:r>
+        <w:t xml:space="preserve"> in the </w:t>
+      </w:r>
+      <w:r>
+        <w:rPr>
+          <w:b/>
+          <w:bCs/>
+        </w:rPr>
+        <w:t>production bundle</w:t>
+      </w:r>
+      <w:r>
+        <w:t>.</w:t>
       </w:r>
     </w:p>
     <w:p>
@@ -1182,16 +3447,13 @@
         <w:t>25. Complete the final production acceptance checklist</w:t>
       </w:r>
       <w:r>
-        <w:t xml:space="preserve"> </w:t>
-      </w:r>
-      <w:r>
-        <w:t xml:space="preserve">– </w:t>
-      </w:r>
-      <w:r>
-        <w:rPr>
-          <w:color w:val="EE0000"/>
-        </w:rPr>
-        <w:t>NOT STARTED</w:t>
+        <w:t xml:space="preserve"> – </w:t>
+      </w:r>
+      <w:r>
+        <w:rPr>
+          <w:color w:val="00B050"/>
+        </w:rPr>
+        <w:t>COMPLETE</w:t>
       </w:r>
     </w:p>
     <w:p>
@@ -2334,7 +4596,6 @@
   <w:style w:type="character" w:default="1" w:styleId="DefaultParagraphFont">
     <w:name w:val="Default Paragraph Font"/>
     <w:uiPriority w:val="1"/>
-    <w:semiHidden/>
     <w:unhideWhenUsed/>
   </w:style>
   <w:style w:type="table" w:default="1" w:styleId="TableNormal">

</xml_diff>